<commit_message>
Dated cover letter; PDF copies of cover letter and highlights
</commit_message>
<xml_diff>
--- a/paper/highlights.docx
+++ b/paper/highlights.docx
@@ -7,6 +7,11 @@
         <w:pStyle w:val="Heading1"/>
       </w:pPr>
       <w:r>
+        <w:rPr>
+          <w:rFonts w:ascii="Times New Roman" w:hAnsi="Times New Roman"/>
+          <w:color w:val="000000"/>
+          <w:sz w:val="28"/>
+        </w:rPr>
         <w:t>Highlights</w:t>
       </w:r>
     </w:p>
@@ -15,6 +20,9 @@
         <w:pStyle w:val="ListBullet"/>
       </w:pPr>
       <w:r>
+        <w:rPr>
+          <w:rFonts w:ascii="Times New Roman" w:hAnsi="Times New Roman"/>
+        </w:rPr>
         <w:t>One-hertz drive-test rows carry the post-handover cell before the handover command.</w:t>
       </w:r>
     </w:p>
@@ -23,6 +31,9 @@
         <w:pStyle w:val="ListBullet"/>
       </w:pPr>
       <w:r>
+        <w:rPr>
+          <w:rFonts w:ascii="Times New Roman" w:hAnsi="Times New Roman"/>
+        </w:rPr>
         <w:t>Ignoring this inflates one-second handover-prediction AUPRC about four-fold.</w:t>
       </w:r>
     </w:p>
@@ -31,6 +42,9 @@
         <w:pStyle w:val="ListBullet"/>
       </w:pPr>
       <w:r>
+        <w:rPr>
+          <w:rFonts w:ascii="Times New Roman" w:hAnsi="Times New Roman"/>
+        </w:rPr>
         <w:t>Serving-cell radio scalars, not cell identifiers, carry 94% of the leak.</w:t>
       </w:r>
     </w:p>
@@ -39,6 +53,9 @@
         <w:pStyle w:val="ListBullet"/>
       </w:pPr>
       <w:r>
+        <w:rPr>
+          <w:rFonts w:ascii="Times New Roman" w:hAnsi="Times New Roman"/>
+        </w:rPr>
         <w:t>Splitting protocol reorders learner rankings, not just their scores.</w:t>
       </w:r>
     </w:p>
@@ -47,6 +64,9 @@
         <w:pStyle w:val="ListBullet"/>
       </w:pPr>
       <w:r>
+        <w:rPr>
+          <w:rFonts w:ascii="Times New Roman" w:hAnsi="Times New Roman"/>
+        </w:rPr>
         <w:t>The leak replicates blind on a second operator; learner rankings do not.</w:t>
       </w:r>
     </w:p>

</xml_diff>